<commit_message>
Add supplier item catalog selection
</commit_message>
<xml_diff>
--- a/CLIENT_TESTING_GUIDE.docx
+++ b/CLIENT_TESTING_GUIDE.docx
@@ -896,6 +896,14 @@
         <w:pStyle w:val="ListParagraph"/>
       </w:pPr>
       <w:r>
+        <w:t xml:space="preserve">- Supplier items.</w:t>
+      </w:r>
+    </w:p>
+    <w:p>
+      <w:pPr>
+        <w:pStyle w:val="ListParagraph"/>
+      </w:pPr>
+      <w:r>
         <w:t xml:space="preserve">- Locations.</w:t>
       </w:r>
     </w:p>
@@ -1045,6 +1053,30 @@
         <w:t xml:space="preserve">14. Correct the Error Report workbook and upload it again.</w:t>
       </w:r>
     </w:p>
+    <w:p>
+      <w:pPr>
+        <w:pStyle w:val="ListParagraph"/>
+      </w:pPr>
+      <w:r>
+        <w:t xml:space="preserve">15. Create Supplier Item rows for the same internal item with different suppliers or brands.</w:t>
+      </w:r>
+    </w:p>
+    <w:p>
+      <w:pPr>
+        <w:pStyle w:val="ListParagraph"/>
+      </w:pPr>
+      <w:r>
+        <w:t xml:space="preserve">16. Open Purchasing, select a supplier, and confirm only that supplier's catalog items appear in the line selector.</w:t>
+      </w:r>
+    </w:p>
+    <w:p>
+      <w:pPr>
+        <w:pStyle w:val="ListParagraph"/>
+      </w:pPr>
+      <w:r>
+        <w:t xml:space="preserve">17. Select a catalog item and confirm brand, supplier SKU, pack, UOM, and default cost are clear enough to avoid choosing the wrong item.</w:t>
+      </w:r>
+    </w:p>
     <w:p/>
     <w:p>
       <w:pPr>
@@ -1095,6 +1127,14 @@
         <w:t xml:space="preserve">- Failed import rows can be downloaded, corrected, and resubmitted.</w:t>
       </w:r>
     </w:p>
+    <w:p>
+      <w:pPr>
+        <w:pStyle w:val="ListParagraph"/>
+      </w:pPr>
+      <w:r>
+        <w:t xml:space="preserve">- Purchasing users select supplier catalog items while inventory remains consolidated under the internal item.</w:t>
+      </w:r>
+    </w:p>
     <w:p/>
     <w:p>
       <w:pPr>
@@ -1185,6 +1225,22 @@
         <w:t xml:space="preserve">- Invalid workbook type or missing workbook file.</w:t>
       </w:r>
     </w:p>
+    <w:p>
+      <w:pPr>
+        <w:pStyle w:val="ListParagraph"/>
+      </w:pPr>
+      <w:r>
+        <w:t xml:space="preserve">- Same internal item offered by different suppliers, brands, packs, or supplier SKUs.</w:t>
+      </w:r>
+    </w:p>
+    <w:p>
+      <w:pPr>
+        <w:pStyle w:val="ListParagraph"/>
+      </w:pPr>
+      <w:r>
+        <w:t xml:space="preserve">- Purchase order supplier changed after line items were entered.</w:t>
+      </w:r>
+    </w:p>
     <w:p/>
     <w:p>
       <w:pPr>
@@ -4686,7 +4742,6 @@
         <w:t xml:space="preserve">```</w:t>
       </w:r>
     </w:p>
-    <w:p/>
     <w:sectPr>
       <w:pgSz w:w="12240" w:h="15840"/>
       <w:pgMar w:top="1440" w:right="1440" w:bottom="1440" w:left="1440"/>
@@ -4701,7 +4756,6 @@
     <w:name w:val="Normal"/>
     <w:rPr>
       <w:sz w:val="22"/>
-      <w:szCs w:val="22"/>
     </w:rPr>
   </w:style>
   <w:style w:type="paragraph" w:styleId="Title">
@@ -4709,7 +4763,6 @@
     <w:rPr>
       <w:b/>
       <w:sz w:val="36"/>
-      <w:szCs w:val="36"/>
     </w:rPr>
   </w:style>
   <w:style w:type="paragraph" w:styleId="Heading2">
@@ -4717,7 +4770,6 @@
     <w:rPr>
       <w:b/>
       <w:sz w:val="30"/>
-      <w:szCs w:val="30"/>
     </w:rPr>
   </w:style>
   <w:style w:type="paragraph" w:styleId="Heading3">
@@ -4725,7 +4777,6 @@
     <w:rPr>
       <w:b/>
       <w:sz w:val="26"/>
-      <w:szCs w:val="26"/>
     </w:rPr>
   </w:style>
   <w:style w:type="paragraph" w:styleId="ListParagraph">

</xml_diff>